<commit_message>
Restore V6 evidence collection and configurable early-exit controls
</commit_message>
<xml_diff>
--- a/MASTER_KT_HANDOVER.docx
+++ b/MASTER_KT_HANDOVER.docx
@@ -5665,7 +5665,7 @@
         </w:rPr>
       </w:pPr>
       <w:r>
-        <w:t>Evidence collection runs after the primary prediction on copied RGB data. Each collector failure is isolated, rolls back partial feature writes, and reports a status such as available, disabled, or unavailable. No missing collector is replaced with fake contour or synthetic dense-depth evidence.</w:t>
+        <w:t>Eligibility is checked before depth inference in the shared V6 pipeline. The first stage runs only WaterRegionDetector and the configured no-water and wet-road classifiers. A confidently corroborated no-water decision stops before YOLO, EfficientNet, relative depth, correction and Gemini; the application displays 0.00 cm while primary and final V6 metric fields remain null. If water evidence is uncertain, conflicting or unavailable, the next stage runs YOLO. A successful YOLO result with zero eligible references stops before the downstream depth models; the application displays N/A and stores null numeric depths. YOLO failure never means zero references. The independent config switches inference.v6_eligibility.no_water_zero_enabled and no_reference_na_enabled remain true by default and can each be disabled. If both are disabled, normal V6 prediction continues. The original V5 pipeline used a late no-water overwrite, while its API separately returned N/A for zero references; V6 uses early exits without changing EfficientNet or the correction policy. CLI, UI, API, worker, video, CSV and JSON expose status/comment and decision source for each outcome.</w:t>
       </w:r>
     </w:p>
     <w:p>
@@ -5683,7 +5683,7 @@
         </w:rPr>
       </w:pPr>
       <w:r>
-        <w:t>Purpose: understand why diagnostic candidates do not currently change the V6 number. controlled_correction() in src/v6_shadow_pipeline.py is the sole internal authority allowed to accept a V6 metric correction. It currently implements shadow/abstain behavior.</w:t>
+        <w:t>Purpose: understand when model evidence may change the V6 number. controlled_correction() in src/v6_shadow_pipeline.py is the sole internal authority allowed to accept a metric correction. It requires a separately validated metric candidate, an approved source and operating regime, and all declared supporting collectors. Context agreement by itself is not proof of metric accuracy.</w:t>
       </w:r>
     </w:p>
     <w:p>
@@ -5696,30 +5696,9 @@
         </w:rPr>
       </w:pPr>
       <w:r>
-        <w:rPr>
-          <w:rFonts w:ascii="Consolas" w:hAnsi="Consolas"/>
-          <w:color w:val="1E3046"/>
-          <w:sz w:val="16"/>
-        </w:rPr>
         <w:t>original_primary_depth_cm + accepted_delta_cm = final_v6_depth_cm</w:t>
-      </w:r>
-      <w:r>
-        <w:rPr>
-          <w:rFonts w:ascii="Consolas" w:hAnsi="Consolas"/>
-          <w:color w:val="1E3046"/>
-          <w:sz w:val="16"/>
-        </w:rPr>
         <w:br/>
-        <w:t>Current behavior: accepted_delta_cm = 0</w:t>
-      </w:r>
-      <w:r>
-        <w:rPr>
-          <w:rFonts w:ascii="Consolas" w:hAnsi="Consolas"/>
-          <w:color w:val="1E3046"/>
-          <w:sz w:val="16"/>
-        </w:rPr>
-        <w:br/>
-        <w:t>final_v6_depth_cm = primary_depth_cm</w:t>
+        <w:t>Current approval registry: empty; accepted_delta_cm = 0; final_v6_depth_cm = primary_depth_cm</w:t>
       </w:r>
     </w:p>
     <w:p>
@@ -5729,8 +5708,7 @@
         </w:rPr>
       </w:pPr>
       <w:r>
-        <w:lastRenderedPageBreak/>
-        <w:t>If a region-depth or mask-conditioned candidate is present, the policy records a rejected proposal with source, proposal, zero correction amount, reason shadow_only_no_validated_acceptance_rule, evidence ID, and unchanged final depth. If there is no candidate, it records abstain_no_validated_metric_candidate. The evidence collector currently marks these experimental candidates not collected, so ordinary runs typically produce the abstain record.</w:t>
+        <w:t>The v6_controlled_correction block in config/config.yaml currently has enabled=true, max_abs_delta_cm=5.0, max_relative_delta_fraction=0.20 and approved_candidates=[]. A proposal must satisfy both absolute and relative limits; an over-budget value is rejected, not clamped. Code rejects an absolute budget above 5 cm. The trace records proposed depth, source, evidence IDs, acceptance or rejection reason, and final value. Conflicting candidates, missing dependencies, unsupported regimes, and invalid values cause abstention. An empty approval list means ordinary runs preserve the original EfficientNet depth.</w:t>
       </w:r>
     </w:p>
     <w:p>
@@ -5740,7 +5718,7 @@
         </w:rPr>
       </w:pPr>
       <w:r>
-        <w:t>This is deliberate: secondary signals have not been shown safe enough for metric authority in the active policy. No threshold or correction budget is currently configured as an automatic acceptance rule. Changing an authority enum or an old config flag does not enable promotion. A future policy requires a documented evidence-backed acceptance rule and tests, plus paired evaluation on development data without consuming the frozen challenge set.</w:t>
+        <w:t>On 99 development-validation rows, the unchanged EfficientNet and current policy both have MAE 9.17 cm and RMSE 13.04 cm, with zero predictions changed. A hypothetical bounded correction toward the historical region estimate worsened MAE to 9.95 cm and RMSE to 14.26 cm; 45 rows improved and 54 worsened. That candidate was rejected. The local comparison artifact is reports/v6_controlled_correction_development/validation_comparison.json. No secondary metric candidate currently has numerical promotion authority. Future approval requires independent development evidence and a frozen challenge evaluation; do not use consumed challenge data to tune rules.</w:t>
       </w:r>
     </w:p>
     <w:p>
@@ -15906,6 +15884,253 @@
       </w:pPr>
       <w:r>
         <w:t>The clean-run command is supported by source and test files, but a Python 3.11 installation was not available in this audit session. After fixing the stale opt-in real-checkpoint test and isolating Gemini, run that approved-input parity gate; keep its input/checkpoint hashes and saved-frame result. Do not promote a candidate until measured group-safe validation, frozen baseline comparison, human-reviewed freeze identity, and acceptance thresholds are in place.</w:t>
+      </w:r>
+    </w:p>
+    <w:p>
+      <w:pPr>
+        <w:pStyle w:val="Heading1"/>
+      </w:pPr>
+      <w:r>
+        <w:t>Water eligibility and restored evidence</w:t>
+      </w:r>
+    </w:p>
+    <w:p>
+      <w:r>
+        <w:t>The shared V6 pipeline collects diagnostic evidence before calling EfficientNet. The active collectors are the classical WaterRegionDetector, local YOLO, local Depth Anything V2, and the available road-scene, no-water, wet-road, and depth-regime classifiers. A collector records available, disabled, or unavailable with a safe reason. YOLO ran and found zero eligible objects is distinct from YOLO failed or unavailable.</w:t>
+      </w:r>
+    </w:p>
+    <w:p>
+      <w:r>
+        <w:t>Historical behavior verified in the V5 source: there was no pre-depth skip. EfficientNet ran first; a late no-water guard could replace the final depth with 0 when classifier and low-coverage evidence corroborated dry/wet road. Zero reference objects alone did not make the entire V5 result unavailable. V6 keeps the corroborated criteria from config/config.yaml but converts the decision into a pre-depth skip, never a numerical zero. Because current mask overlap is not calibrated physical submersion, V6 requires a successful YOLO run with zero eligible objects before skipping. Missing or conflicting evidence causes the gate to abstain and EfficientNet to run.</w:t>
+      </w:r>
+    </w:p>
+    <w:tbl>
+      <w:tblPr>
+        <w:tblStyle w:val="TableGrid"/>
+        <w:tblW w:type="auto" w:w="0"/>
+        <w:tblLook w:firstColumn="1" w:firstRow="1" w:lastColumn="0" w:lastRow="0" w:noHBand="0" w:noVBand="1" w:val="04A0"/>
+      </w:tblPr>
+      <w:tblGrid>
+        <w:gridCol w:w="3389"/>
+        <w:gridCol w:w="3389"/>
+        <w:gridCol w:w="3389"/>
+      </w:tblGrid>
+      <w:tr>
+        <w:tc>
+          <w:tcPr>
+            <w:tcW w:type="dxa" w:w="3389"/>
+          </w:tcPr>
+          <w:p>
+            <w:r>
+              <w:t>Condition</w:t>
+            </w:r>
+          </w:p>
+        </w:tc>
+        <w:tc>
+          <w:tcPr>
+            <w:tcW w:type="dxa" w:w="3389"/>
+          </w:tcPr>
+          <w:p>
+            <w:r>
+              <w:t>V6 behavior</w:t>
+            </w:r>
+          </w:p>
+        </w:tc>
+        <w:tc>
+          <w:tcPr>
+            <w:tcW w:type="dxa" w:w="3389"/>
+          </w:tcPr>
+          <w:p>
+            <w:r>
+              <w:t>Reported values</w:t>
+            </w:r>
+          </w:p>
+        </w:tc>
+      </w:tr>
+      <w:tr>
+        <w:tc>
+          <w:tcPr>
+            <w:tcW w:type="dxa" w:w="3389"/>
+          </w:tcPr>
+          <w:p>
+            <w:r>
+              <w:t>Corroborated no flood water</w:t>
+            </w:r>
+          </w:p>
+        </w:tc>
+        <w:tc>
+          <w:tcPr>
+            <w:tcW w:type="dxa" w:w="3389"/>
+          </w:tcPr>
+          <w:p>
+            <w:r>
+              <w:t>Skip EfficientNet and Gemini</w:t>
+            </w:r>
+          </w:p>
+        </w:tc>
+        <w:tc>
+          <w:tcPr>
+            <w:tcW w:type="dxa" w:w="3389"/>
+          </w:tcPr>
+          <w:p>
+            <w:r>
+              <w:t>water_present=false; depth_inference_skipped=true; skip_reason=no_flood_water_detected; all depth values null</w:t>
+            </w:r>
+          </w:p>
+        </w:tc>
+      </w:tr>
+      <w:tr>
+        <w:tc>
+          <w:tcPr>
+            <w:tcW w:type="dxa" w:w="3389"/>
+          </w:tcPr>
+          <w:p>
+            <w:r>
+              <w:t>Uncertain or missing gate evidence</w:t>
+            </w:r>
+          </w:p>
+        </w:tc>
+        <w:tc>
+          <w:tcPr>
+            <w:tcW w:type="dxa" w:w="3389"/>
+          </w:tcPr>
+          <w:p>
+            <w:r>
+              <w:t>Proceed with EfficientNet</w:t>
+            </w:r>
+          </w:p>
+        </w:tc>
+        <w:tc>
+          <w:tcPr>
+            <w:tcW w:type="dxa" w:w="3389"/>
+          </w:tcPr>
+          <w:p>
+            <w:r>
+              <w:t>water_present=null; water_gate explains abstention</w:t>
+            </w:r>
+          </w:p>
+        </w:tc>
+      </w:tr>
+      <w:tr>
+        <w:tc>
+          <w:tcPr>
+            <w:tcW w:type="dxa" w:w="3389"/>
+          </w:tcPr>
+          <w:p>
+            <w:r>
+              <w:t>YOLO completed with zero objects only</w:t>
+            </w:r>
+          </w:p>
+        </w:tc>
+        <w:tc>
+          <w:tcPr>
+            <w:tcW w:type="dxa" w:w="3389"/>
+          </w:tcPr>
+          <w:p>
+            <w:r>
+              <w:t>Proceed unless no-water gate is also corroborated</w:t>
+            </w:r>
+          </w:p>
+        </w:tc>
+        <w:tc>
+          <w:tcPr>
+            <w:tcW w:type="dxa" w:w="3389"/>
+          </w:tcPr>
+          <w:p>
+            <w:r>
+              <w:t>reference_eligibility=none_found</w:t>
+            </w:r>
+          </w:p>
+        </w:tc>
+      </w:tr>
+      <w:tr>
+        <w:tc>
+          <w:tcPr>
+            <w:tcW w:type="dxa" w:w="3389"/>
+          </w:tcPr>
+          <w:p>
+            <w:r>
+              <w:t>YOLO failed or unavailable</w:t>
+            </w:r>
+          </w:p>
+        </w:tc>
+        <w:tc>
+          <w:tcPr>
+            <w:tcW w:type="dxa" w:w="3389"/>
+          </w:tcPr>
+          <w:p>
+            <w:r>
+              <w:t>Proceed; never infer zero objects</w:t>
+            </w:r>
+          </w:p>
+        </w:tc>
+        <w:tc>
+          <w:tcPr>
+            <w:tcW w:type="dxa" w:w="3389"/>
+          </w:tcPr>
+          <w:p>
+            <w:r>
+              <w:t>reference_eligibility=unavailable</w:t>
+            </w:r>
+          </w:p>
+        </w:tc>
+      </w:tr>
+      <w:tr>
+        <w:tc>
+          <w:tcPr>
+            <w:tcW w:type="dxa" w:w="3389"/>
+          </w:tcPr>
+          <w:p>
+            <w:r>
+              <w:t>Flood evidence or non-corroborated classifier</w:t>
+            </w:r>
+          </w:p>
+        </w:tc>
+        <w:tc>
+          <w:tcPr>
+            <w:tcW w:type="dxa" w:w="3389"/>
+          </w:tcPr>
+          <w:p>
+            <w:r>
+              <w:t>Proceed with EfficientNet</w:t>
+            </w:r>
+          </w:p>
+        </w:tc>
+        <w:tc>
+          <w:tcPr>
+            <w:tcW w:type="dxa" w:w="3389"/>
+          </w:tcPr>
+          <w:p>
+            <w:r>
+              <w:t>Primary and final V6 values retain baseline ownership</w:t>
+            </w:r>
+          </w:p>
+        </w:tc>
+      </w:tr>
+    </w:tbl>
+    <w:p>
+      <w:r>
+        <w:t>The immutable primary depth remains the EfficientNet metric result. Water percentages are mask coverage, not depth. YOLO boxes and mask overlap are visual context, not calibrated centimetres. Depth Anything is relative and non-metric. Road-scene and depth-regime outputs are semantic probabilities. The historical mask-conditioned candidate is not collected because its full V5 feature contract is not independently validated for V6. controlled_correction() is the sole internal decision point and currently abstains from all numerical proposals.</w:t>
+      </w:r>
+    </w:p>
+    <w:p>
+      <w:r>
+        <w:t>Gemini remains outside the V6 numerical decision. The shared review boundary sends the original image, unchanged primary/final V6 values, genuine evidence, and correction trace. A valid configured correction can change only application_final_depth_cm. A failed or skipped review preserves V6. Safe error codes now distinguish missing key, authentication, quota, HTTP/transport, model/endpoint, request payload, blocked response, malformed JSON, schema failure, and correction validation. The historical generic ValueError line cannot by itself reveal the old API response. GOOGLE_API_KEY was absent in the verification process, so no real request was made.</w:t>
+      </w:r>
+    </w:p>
+    <w:p>
+      <w:r>
+        <w:t>For a detailed run use: python main.py image "&lt;image_path&gt;" --storage local --verbose. The default console remains concise. CSV includes water_present, water_gate, reference_eligibility, depth_inference_skipped, and skip_reason. The JSON debug report retains the full collector statuses, evidence, and correction trace. CLI, UI, API, worker, and saved-JPEG video frames use the same shared V6 result. Video Gemini review remains opt-in.</w:t>
+      </w:r>
+    </w:p>
+    <w:p>
+      <w:r>
+        <w:t>Verification on the approved 01_test.jpg image: with evidence disabled, primary/final V6 depth was 54.92 cm; with the restored collectors, primary/final V6 depth was 54.92 cm. Difference: 0.0 cm. The collectors for water, YOLO, relative depth, road scene, no-water, wet-road, and depth regime all reported available. This is parity evidence for one image, not an accuracy claim. Fresh frozen labelled evaluation is needed before production acceptance of the eligibility gate or any numerical correction.</w:t>
+      </w:r>
+    </w:p>
+    <w:p>
+      <w:r>
+        <w:t>The opt-in real-checkpoint parity smoke passed on the previously approved image and saved video frame. The main image CLI, direct V6, diagnostic CLI, UI, API, and worker all returned primary and final V6 depth 7.68 cm, with 0.0 cm difference. The saved video frame and independent image CLI both returned 77.39 cm, with 0.0 cm difference. This verifies execution parity, not accuracy. The maintained tests/ suite passed 131 tests, with one opt-in smoke skipped; the real smoke passed separately. The root-wide pytest command remains blocked during collection by the standalone S3 integration script without cloud setup.</w:t>
       </w:r>
     </w:p>
     <w:sectPr>

</xml_diff>